<commit_message>
responsice reklamation chatbot agent
</commit_message>
<xml_diff>
--- a/frontend/Fragmento-content-review-en-de.docx
+++ b/frontend/Fragmento-content-review-en-de.docx
@@ -12,7 +12,7 @@
     </w:p>
     <w:p>
       <w:r>
-        <w:t xml:space="preserve">Generated from frontend locale and service-claim content files. Total review rows: 981.</w:t>
+        <w:t xml:space="preserve">Generated from frontend locale and service-claim content files. Total review rows: 992.</w:t>
       </w:r>
     </w:p>
     <w:tbl>
@@ -2369,17 +2369,21 @@
           </w:tcPr>
           <w:p>
             <w:r>
-              <w:t xml:space="preserve">Components and options</w:t>
-            </w:r>
-          </w:p>
-        </w:tc>
-        <w:tc>
-          <w:tcPr>
-            <w:tcW w:w="2400" w:type="dxa"/>
-          </w:tcPr>
-          <w:p>
-            <w:r>
-              <w:t xml:space="preserve">Bauteile und Optionen</w:t>
+              <w:t xml:space="preserve">
+                Additional items for your
+                <w:br/>
+                built-in kitchen
+              </w:t>
+            </w:r>
+          </w:p>
+        </w:tc>
+        <w:tc>
+          <w:tcPr>
+            <w:tcW w:w="2400" w:type="dxa"/>
+          </w:tcPr>
+          <w:p>
+            <w:r>
+              <w:t xml:space="preserve">Ergänzungsartikel zu deiner individuellen Einbauküche</w:t>
             </w:r>
           </w:p>
         </w:tc>
@@ -2495,17 +2499,17 @@
           </w:tcPr>
           <w:p>
             <w:r>
-              <w:t xml:space="preserve">Configure your kitchen directly from the current catalog.</w:t>
-            </w:r>
-          </w:p>
-        </w:tc>
-        <w:tc>
-          <w:tcPr>
-            <w:tcW w:w="2400" w:type="dxa"/>
-          </w:tcPr>
-          <w:p>
-            <w:r>
-              <w:t xml:space="preserve">Konfiguriere deine Küche direkt aus dem aktuellen Katalog.</w:t>
+              <w:t xml:space="preserve">Choose additional items for your built-in kitchen.</w:t>
+            </w:r>
+          </w:p>
+        </w:tc>
+        <w:tc>
+          <w:tcPr>
+            <w:tcW w:w="2400" w:type="dxa"/>
+          </w:tcPr>
+          <w:p>
+            <w:r>
+              <w:t xml:space="preserve">Suchen Sie sich die Ergänzungsartikel für Ihre Einbauküche aus.</w:t>
             </w:r>
           </w:p>
         </w:tc>
@@ -2537,17 +2541,17 @@
           </w:tcPr>
           <w:p>
             <w:r>
-              <w:t xml:space="preserve">Your kitchen</w:t>
-            </w:r>
-          </w:p>
-        </w:tc>
-        <w:tc>
-          <w:tcPr>
-            <w:tcW w:w="2400" w:type="dxa"/>
-          </w:tcPr>
-          <w:p>
-            <w:r>
-              <w:t xml:space="preserve">Deine Küche</w:t>
+              <w:t xml:space="preserve">Your individual built-in kitchen</w:t>
+            </w:r>
+          </w:p>
+        </w:tc>
+        <w:tc>
+          <w:tcPr>
+            <w:tcW w:w="2400" w:type="dxa"/>
+          </w:tcPr>
+          <w:p>
+            <w:r>
+              <w:t xml:space="preserve">Deine individuelle Einbauküche</w:t>
             </w:r>
           </w:p>
         </w:tc>
@@ -5309,17 +5313,17 @@
           </w:tcPr>
           <w:p>
             <w:r>
-              <w:t xml:space="preserve">Interactive kitchen view</w:t>
-            </w:r>
-          </w:p>
-        </w:tc>
-        <w:tc>
-          <w:tcPr>
-            <w:tcW w:w="2400" w:type="dxa"/>
-          </w:tcPr>
-          <w:p>
-            <w:r>
-              <w:t xml:space="preserve">Interaktive Küchenansicht</w:t>
+              <w:t xml:space="preserve">Plan your individual kitchen</w:t>
+            </w:r>
+          </w:p>
+        </w:tc>
+        <w:tc>
+          <w:tcPr>
+            <w:tcW w:w="2400" w:type="dxa"/>
+          </w:tcPr>
+          <w:p>
+            <w:r>
+              <w:t xml:space="preserve">Plane deine individuelle Küche</w:t>
             </w:r>
           </w:p>
         </w:tc>
@@ -5362,6 +5366,48 @@
           <w:p>
             <w:r>
               <w:t xml:space="preserve">Bitte bestätige die Datenschutzeinwilligung.</w:t>
+            </w:r>
+          </w:p>
+        </w:tc>
+      </w:tr>
+      <w:tr>
+        <w:tc>
+          <w:tcPr>
+            <w:tcW w:w="2400" w:type="dxa"/>
+          </w:tcPr>
+          <w:p>
+            <w:r>
+              <w:t xml:space="preserve">Public site locale</w:t>
+            </w:r>
+          </w:p>
+        </w:tc>
+        <w:tc>
+          <w:tcPr>
+            <w:tcW w:w="2400" w:type="dxa"/>
+          </w:tcPr>
+          <w:p>
+            <w:r>
+              <w:t xml:space="preserve">configurator.statusConfirmTerms</w:t>
+            </w:r>
+          </w:p>
+        </w:tc>
+        <w:tc>
+          <w:tcPr>
+            <w:tcW w:w="2400" w:type="dxa"/>
+          </w:tcPr>
+          <w:p>
+            <w:r>
+              <w:t xml:space="preserve">Please confirm that you have read and accept the terms and conditions.</w:t>
+            </w:r>
+          </w:p>
+        </w:tc>
+        <w:tc>
+          <w:tcPr>
+            <w:tcW w:w="2400" w:type="dxa"/>
+          </w:tcPr>
+          <w:p>
+            <w:r>
+              <w:t xml:space="preserve">Bitte bestätige, dass du die AGBs gelesen hast und zustimmst.</w:t>
             </w:r>
           </w:p>
         </w:tc>
@@ -7627,17 +7673,17 @@
           </w:tcPr>
           <w:p>
             <w:r>
-              <w:t xml:space="preserve">I agree to the processing of my data for the purpose of this order.*</w:t>
-            </w:r>
-          </w:p>
-        </w:tc>
-        <w:tc>
-          <w:tcPr>
-            <w:tcW w:w="2400" w:type="dxa"/>
-          </w:tcPr>
-          <w:p>
-            <w:r>
-              <w:t xml:space="preserve">Ich stimme der Verarbeitung meiner Daten zum Zweck der Bestellung zu.*</w:t>
+              <w:t xml:space="preserve">I have read the privacy policy and confirm that my order data may be used to process this order.*</w:t>
+            </w:r>
+          </w:p>
+        </w:tc>
+        <w:tc>
+          <w:tcPr>
+            <w:tcW w:w="2400" w:type="dxa"/>
+          </w:tcPr>
+          <w:p>
+            <w:r>
+              <w:t xml:space="preserve">Ich habe die Datenschutzerklärung gelesen und bestätige, dass meine Bestelldaten zur Bearbeitung dieser Bestellung verwendet werden dürfen.*</w:t>
             </w:r>
           </w:p>
         </w:tc>
@@ -7659,6 +7705,174 @@
           </w:tcPr>
           <w:p>
             <w:r>
+              <w:t xml:space="preserve">order.consentPrefix</w:t>
+            </w:r>
+          </w:p>
+        </w:tc>
+        <w:tc>
+          <w:tcPr>
+            <w:tcW w:w="2400" w:type="dxa"/>
+          </w:tcPr>
+          <w:p>
+            <w:r>
+              <w:t xml:space="preserve">I have read the </w:t>
+            </w:r>
+          </w:p>
+        </w:tc>
+        <w:tc>
+          <w:tcPr>
+            <w:tcW w:w="2400" w:type="dxa"/>
+          </w:tcPr>
+          <w:p>
+            <w:r>
+              <w:t xml:space="preserve">Ich habe die </w:t>
+            </w:r>
+          </w:p>
+        </w:tc>
+      </w:tr>
+      <w:tr>
+        <w:tc>
+          <w:tcPr>
+            <w:tcW w:w="2400" w:type="dxa"/>
+          </w:tcPr>
+          <w:p>
+            <w:r>
+              <w:t xml:space="preserve">Public site locale</w:t>
+            </w:r>
+          </w:p>
+        </w:tc>
+        <w:tc>
+          <w:tcPr>
+            <w:tcW w:w="2400" w:type="dxa"/>
+          </w:tcPr>
+          <w:p>
+            <w:r>
+              <w:t xml:space="preserve">order.consentShortPrefix</w:t>
+            </w:r>
+          </w:p>
+        </w:tc>
+        <w:tc>
+          <w:tcPr>
+            <w:tcW w:w="2400" w:type="dxa"/>
+          </w:tcPr>
+          <w:p>
+            <w:r>
+              <w:t xml:space="preserve">I accept the </w:t>
+            </w:r>
+          </w:p>
+        </w:tc>
+        <w:tc>
+          <w:tcPr>
+            <w:tcW w:w="2400" w:type="dxa"/>
+          </w:tcPr>
+          <w:p>
+            <w:r>
+              <w:t xml:space="preserve">Ich stimme der </w:t>
+            </w:r>
+          </w:p>
+        </w:tc>
+      </w:tr>
+      <w:tr>
+        <w:tc>
+          <w:tcPr>
+            <w:tcW w:w="2400" w:type="dxa"/>
+          </w:tcPr>
+          <w:p>
+            <w:r>
+              <w:t xml:space="preserve">Public site locale</w:t>
+            </w:r>
+          </w:p>
+        </w:tc>
+        <w:tc>
+          <w:tcPr>
+            <w:tcW w:w="2400" w:type="dxa"/>
+          </w:tcPr>
+          <w:p>
+            <w:r>
+              <w:t xml:space="preserve">order.consentShortSuffix</w:t>
+            </w:r>
+          </w:p>
+        </w:tc>
+        <w:tc>
+          <w:tcPr>
+            <w:tcW w:w="2400" w:type="dxa"/>
+          </w:tcPr>
+          <w:p>
+            <w:r>
+              <w:t xml:space="preserve">.*</w:t>
+            </w:r>
+          </w:p>
+        </w:tc>
+        <w:tc>
+          <w:tcPr>
+            <w:tcW w:w="2400" w:type="dxa"/>
+          </w:tcPr>
+          <w:p>
+            <w:r>
+              <w:t xml:space="preserve"> zu.*</w:t>
+            </w:r>
+          </w:p>
+        </w:tc>
+      </w:tr>
+      <w:tr>
+        <w:tc>
+          <w:tcPr>
+            <w:tcW w:w="2400" w:type="dxa"/>
+          </w:tcPr>
+          <w:p>
+            <w:r>
+              <w:t xml:space="preserve">Public site locale</w:t>
+            </w:r>
+          </w:p>
+        </w:tc>
+        <w:tc>
+          <w:tcPr>
+            <w:tcW w:w="2400" w:type="dxa"/>
+          </w:tcPr>
+          <w:p>
+            <w:r>
+              <w:t xml:space="preserve">order.consentSuffix</w:t>
+            </w:r>
+          </w:p>
+        </w:tc>
+        <w:tc>
+          <w:tcPr>
+            <w:tcW w:w="2400" w:type="dxa"/>
+          </w:tcPr>
+          <w:p>
+            <w:r>
+              <w:t xml:space="preserve"> and confirm that my order data may be used to process this order.*</w:t>
+            </w:r>
+          </w:p>
+        </w:tc>
+        <w:tc>
+          <w:tcPr>
+            <w:tcW w:w="2400" w:type="dxa"/>
+          </w:tcPr>
+          <w:p>
+            <w:r>
+              <w:t xml:space="preserve"> gelesen und bestätige, dass meine Bestelldaten zur Bearbeitung dieser Bestellung verwendet werden dürfen.*</w:t>
+            </w:r>
+          </w:p>
+        </w:tc>
+      </w:tr>
+      <w:tr>
+        <w:tc>
+          <w:tcPr>
+            <w:tcW w:w="2400" w:type="dxa"/>
+          </w:tcPr>
+          <w:p>
+            <w:r>
+              <w:t xml:space="preserve">Public site locale</w:t>
+            </w:r>
+          </w:p>
+        </w:tc>
+        <w:tc>
+          <w:tcPr>
+            <w:tcW w:w="2400" w:type="dxa"/>
+          </w:tcPr>
+          <w:p>
+            <w:r>
               <w:t xml:space="preserve">order.contactPersonHelp</w:t>
             </w:r>
           </w:p>
@@ -8331,6 +8545,48 @@
           </w:tcPr>
           <w:p>
             <w:r>
+              <w:t xml:space="preserve">order.fieldErrors.termsConsent</w:t>
+            </w:r>
+          </w:p>
+        </w:tc>
+        <w:tc>
+          <w:tcPr>
+            <w:tcW w:w="2400" w:type="dxa"/>
+          </w:tcPr>
+          <w:p>
+            <w:r>
+              <w:t xml:space="preserve">Please accept the terms and conditions.</w:t>
+            </w:r>
+          </w:p>
+        </w:tc>
+        <w:tc>
+          <w:tcPr>
+            <w:tcW w:w="2400" w:type="dxa"/>
+          </w:tcPr>
+          <w:p>
+            <w:r>
+              <w:t xml:space="preserve">Bitte den AGBs zustimmen.</w:t>
+            </w:r>
+          </w:p>
+        </w:tc>
+      </w:tr>
+      <w:tr>
+        <w:tc>
+          <w:tcPr>
+            <w:tcW w:w="2400" w:type="dxa"/>
+          </w:tcPr>
+          <w:p>
+            <w:r>
+              <w:t xml:space="preserve">Public site locale</w:t>
+            </w:r>
+          </w:p>
+        </w:tc>
+        <w:tc>
+          <w:tcPr>
+            <w:tcW w:w="2400" w:type="dxa"/>
+          </w:tcPr>
+          <w:p>
+            <w:r>
               <w:t xml:space="preserve">order.fieldRequired</w:t>
             </w:r>
           </w:p>
@@ -8635,17 +8891,17 @@
           </w:tcPr>
           <w:p>
             <w:r>
-              <w:t xml:space="preserve">Choose a payment method, leave optional notes, and confirm data privacy consent.</w:t>
-            </w:r>
-          </w:p>
-        </w:tc>
-        <w:tc>
-          <w:tcPr>
-            <w:tcW w:w="2400" w:type="dxa"/>
-          </w:tcPr>
-          <w:p>
-            <w:r>
-              <w:t xml:space="preserve">Wähle eine Zahlungsmethode, hinterlasse optional Hinweise und bestätige den Datenschutz.</w:t>
+              <w:t xml:space="preserve">Add delivery details if needed, then confirm the privacy notice.</w:t>
+            </w:r>
+          </w:p>
+        </w:tc>
+        <w:tc>
+          <w:tcPr>
+            <w:tcW w:w="2400" w:type="dxa"/>
+          </w:tcPr>
+          <w:p>
+            <w:r>
+              <w:t xml:space="preserve">Ergänze bei Bedarf Lieferdetails und bestätige den Datenschutzhinweis.</w:t>
             </w:r>
           </w:p>
         </w:tc>
@@ -8677,17 +8933,17 @@
           </w:tcPr>
           <w:p>
             <w:r>
-              <w:t xml:space="preserve">Payment + consent</w:t>
-            </w:r>
-          </w:p>
-        </w:tc>
-        <w:tc>
-          <w:tcPr>
-            <w:tcW w:w="2400" w:type="dxa"/>
-          </w:tcPr>
-          <w:p>
-            <w:r>
-              <w:t xml:space="preserve">Zahlung + Einwilligung</w:t>
+              <w:t xml:space="preserve">Order notes</w:t>
+            </w:r>
+          </w:p>
+        </w:tc>
+        <w:tc>
+          <w:tcPr>
+            <w:tcW w:w="2400" w:type="dxa"/>
+          </w:tcPr>
+          <w:p>
+            <w:r>
+              <w:t xml:space="preserve">Bestellhinweise</w:t>
             </w:r>
           </w:p>
         </w:tc>
@@ -8835,6 +9091,90 @@
           </w:tcPr>
           <w:p>
             <w:r>
+              <w:t xml:space="preserve">order.privacyPolicy</w:t>
+            </w:r>
+          </w:p>
+        </w:tc>
+        <w:tc>
+          <w:tcPr>
+            <w:tcW w:w="2400" w:type="dxa"/>
+          </w:tcPr>
+          <w:p>
+            <w:r>
+              <w:t xml:space="preserve">privacy policy</w:t>
+            </w:r>
+          </w:p>
+        </w:tc>
+        <w:tc>
+          <w:tcPr>
+            <w:tcW w:w="2400" w:type="dxa"/>
+          </w:tcPr>
+          <w:p>
+            <w:r>
+              <w:t xml:space="preserve">Datenschutzerklärung</w:t>
+            </w:r>
+          </w:p>
+        </w:tc>
+      </w:tr>
+      <w:tr>
+        <w:tc>
+          <w:tcPr>
+            <w:tcW w:w="2400" w:type="dxa"/>
+          </w:tcPr>
+          <w:p>
+            <w:r>
+              <w:t xml:space="preserve">Public site locale</w:t>
+            </w:r>
+          </w:p>
+        </w:tc>
+        <w:tc>
+          <w:tcPr>
+            <w:tcW w:w="2400" w:type="dxa"/>
+          </w:tcPr>
+          <w:p>
+            <w:r>
+              <w:t xml:space="preserve">order.privacyPolicyPending</w:t>
+            </w:r>
+          </w:p>
+        </w:tc>
+        <w:tc>
+          <w:tcPr>
+            <w:tcW w:w="2400" w:type="dxa"/>
+          </w:tcPr>
+          <w:p>
+            <w:r>
+              <w:t xml:space="preserve">Privacy policy will be available soon.</w:t>
+            </w:r>
+          </w:p>
+        </w:tc>
+        <w:tc>
+          <w:tcPr>
+            <w:tcW w:w="2400" w:type="dxa"/>
+          </w:tcPr>
+          <w:p>
+            <w:r>
+              <w:t xml:space="preserve">Die Datenschutzerklärung ist bald verfügbar.</w:t>
+            </w:r>
+          </w:p>
+        </w:tc>
+      </w:tr>
+      <w:tr>
+        <w:tc>
+          <w:tcPr>
+            <w:tcW w:w="2400" w:type="dxa"/>
+          </w:tcPr>
+          <w:p>
+            <w:r>
+              <w:t xml:space="preserve">Public site locale</w:t>
+            </w:r>
+          </w:p>
+        </w:tc>
+        <w:tc>
+          <w:tcPr>
+            <w:tcW w:w="2400" w:type="dxa"/>
+          </w:tcPr>
+          <w:p>
+            <w:r>
               <w:t xml:space="preserve">order.requiredHint</w:t>
             </w:r>
           </w:p>
@@ -9349,17 +9689,17 @@
           </w:tcPr>
           <w:p>
             <w:r>
-              <w:t xml:space="preserve">Submit order</w:t>
-            </w:r>
-          </w:p>
-        </w:tc>
-        <w:tc>
-          <w:tcPr>
-            <w:tcW w:w="2400" w:type="dxa"/>
-          </w:tcPr>
-          <w:p>
-            <w:r>
-              <w:t xml:space="preserve">Bestellung einreichen</w:t>
+              <w:t xml:space="preserve">Order with obligation to pay</w:t>
+            </w:r>
+          </w:p>
+        </w:tc>
+        <w:tc>
+          <w:tcPr>
+            <w:tcW w:w="2400" w:type="dxa"/>
+          </w:tcPr>
+          <w:p>
+            <w:r>
+              <w:t xml:space="preserve">Kostenpflichtig bestellen</w:t>
             </w:r>
           </w:p>
         </w:tc>
@@ -9444,6 +9784,132 @@
           <w:p>
             <w:r>
               <w:t xml:space="preserve">Vorgeschlagene Übereinstimmung</w:t>
+            </w:r>
+          </w:p>
+        </w:tc>
+      </w:tr>
+      <w:tr>
+        <w:tc>
+          <w:tcPr>
+            <w:tcW w:w="2400" w:type="dxa"/>
+          </w:tcPr>
+          <w:p>
+            <w:r>
+              <w:t xml:space="preserve">Public site locale</w:t>
+            </w:r>
+          </w:p>
+        </w:tc>
+        <w:tc>
+          <w:tcPr>
+            <w:tcW w:w="2400" w:type="dxa"/>
+          </w:tcPr>
+          <w:p>
+            <w:r>
+              <w:t xml:space="preserve">order.termsAndConditions</w:t>
+            </w:r>
+          </w:p>
+        </w:tc>
+        <w:tc>
+          <w:tcPr>
+            <w:tcW w:w="2400" w:type="dxa"/>
+          </w:tcPr>
+          <w:p>
+            <w:r>
+              <w:t xml:space="preserve">terms and conditions</w:t>
+            </w:r>
+          </w:p>
+        </w:tc>
+        <w:tc>
+          <w:tcPr>
+            <w:tcW w:w="2400" w:type="dxa"/>
+          </w:tcPr>
+          <w:p>
+            <w:r>
+              <w:t xml:space="preserve">AGBs</w:t>
+            </w:r>
+          </w:p>
+        </w:tc>
+      </w:tr>
+      <w:tr>
+        <w:tc>
+          <w:tcPr>
+            <w:tcW w:w="2400" w:type="dxa"/>
+          </w:tcPr>
+          <w:p>
+            <w:r>
+              <w:t xml:space="preserve">Public site locale</w:t>
+            </w:r>
+          </w:p>
+        </w:tc>
+        <w:tc>
+          <w:tcPr>
+            <w:tcW w:w="2400" w:type="dxa"/>
+          </w:tcPr>
+          <w:p>
+            <w:r>
+              <w:t xml:space="preserve">order.termsConsentPrefix</w:t>
+            </w:r>
+          </w:p>
+        </w:tc>
+        <w:tc>
+          <w:tcPr>
+            <w:tcW w:w="2400" w:type="dxa"/>
+          </w:tcPr>
+          <w:p>
+            <w:r>
+              <w:t xml:space="preserve">I have read the </w:t>
+            </w:r>
+          </w:p>
+        </w:tc>
+        <w:tc>
+          <w:tcPr>
+            <w:tcW w:w="2400" w:type="dxa"/>
+          </w:tcPr>
+          <w:p>
+            <w:r>
+              <w:t xml:space="preserve">Ich habe die </w:t>
+            </w:r>
+          </w:p>
+        </w:tc>
+      </w:tr>
+      <w:tr>
+        <w:tc>
+          <w:tcPr>
+            <w:tcW w:w="2400" w:type="dxa"/>
+          </w:tcPr>
+          <w:p>
+            <w:r>
+              <w:t xml:space="preserve">Public site locale</w:t>
+            </w:r>
+          </w:p>
+        </w:tc>
+        <w:tc>
+          <w:tcPr>
+            <w:tcW w:w="2400" w:type="dxa"/>
+          </w:tcPr>
+          <w:p>
+            <w:r>
+              <w:t xml:space="preserve">order.termsConsentSuffix</w:t>
+            </w:r>
+          </w:p>
+        </w:tc>
+        <w:tc>
+          <w:tcPr>
+            <w:tcW w:w="2400" w:type="dxa"/>
+          </w:tcPr>
+          <w:p>
+            <w:r>
+              <w:t xml:space="preserve"> and agree.*</w:t>
+            </w:r>
+          </w:p>
+        </w:tc>
+        <w:tc>
+          <w:tcPr>
+            <w:tcW w:w="2400" w:type="dxa"/>
+          </w:tcPr>
+          <w:p>
+            <w:r>
+              <w:t xml:space="preserve"> gelesen und stimme zu.*</w:t>
             </w:r>
           </w:p>
         </w:tc>
@@ -25663,7 +26129,7 @@
           </w:tcPr>
           <w:p>
             <w:r>
-              <w:t xml:space="preserve">Gesellschaften öffnen</w:t>
+              <w:t xml:space="preserve">Wohnungsgesellschaften öffnen</w:t>
             </w:r>
           </w:p>
         </w:tc>
@@ -25999,7 +26465,7 @@
           </w:tcPr>
           <w:p>
             <w:r>
-              <w:t xml:space="preserve">Datensätze von Wohnungsgesellschaften, die Vertragsnummern zugewiesen werden können.</w:t>
+              <w:t xml:space="preserve">Datensätze von Wohnungsgesellschaften verfügbar für die Vergabe von Vertragsnummern</w:t>
             </w:r>
           </w:p>
         </w:tc>

</xml_diff>